<commit_message>
Care v2: corretti difetti preesistenti DE 12.4, PL 5.9, PT uniformità terminologica (post_fixes), RU 15.3; supporto post_fixes nel toolkit
Co-Authored-By: Claude Opus 5 (1M context) <noreply@anthropic.com>
Claude-Session: https://claude.ai/code/session_016H7eLscJgXJQePRBmsei8o
</commit_message>
<xml_diff>
--- a/T&C/VAS - Fleequid Care/Vers 2 - Multilanguage - Q3 2026/Condizioni_Specifiche_Fleequid_Care_CSFC-F0002_2026_DEF_DEF_PT.docx
+++ b/T&C/VAS - Fleequid Care/Vers 2 - Multilanguage - Q3 2026/Condizioni_Specifiche_Fleequid_Care_CSFC-F0002_2026_DEF_DEF_PT.docx
@@ -1617,7 +1617,7 @@
           <w:rFonts w:ascii="Verdana" w:hAnsi="Verdana"/>
           <w:sz w:val="20"/>
         </w:rPr>
-        <w:t xml:space="preserve">), que regem o Marketplace Fleequid e que aqui se incorporam e transcrevem na íntegra, aplicam-se as seguintes definições adicionais ou especiais para efeitos dos presentes </w:t>
+        <w:t xml:space="preserve">), que regem o Marketplace Fleequid e que aqui se incorporam e transcrevem na íntegra, aplicam-se as seguintes definições adicionais ou especiais para efeitos das presentes </w:t>
       </w:r>
       <w:r>
         <w:rPr>
@@ -1625,14 +1625,14 @@
           <w:i/>
           <w:sz w:val="20"/>
         </w:rPr>
-        <w:t>Termos e Condições Específicos do Serviço Fleequid Care®</w:t>
-      </w:r>
-      <w:r>
-        <w:rPr>
-          <w:rFonts w:ascii="Verdana" w:hAnsi="Verdana"/>
-          <w:sz w:val="20"/>
-        </w:rPr>
-        <w:t xml:space="preserve"> ("CSFC" ou "Termos e Condições Específicos"): </w:t>
+        <w:t>Condições Específicas do Serviço Fleequid Care®</w:t>
+      </w:r>
+      <w:r>
+        <w:rPr>
+          <w:rFonts w:ascii="Verdana" w:hAnsi="Verdana"/>
+          <w:sz w:val="20"/>
+        </w:rPr>
+        <w:t xml:space="preserve"> ("CSFC" ou "Condições Específicas"): </w:t>
       </w:r>
       <w:bookmarkEnd w:id="0"/>
     </w:p>
@@ -1765,7 +1765,7 @@
           <w:rFonts w:ascii="Verdana" w:hAnsi="Verdana"/>
           <w:sz w:val="20"/>
         </w:rPr>
-        <w:t>": os Termos e Condições Gerais do Marketplace Fleequid®, aos quais os presentes Termos e Condições Específicos complementam e, na medida em que não estejam expressamente regulados, fazem referência. No caso de conflito ou divergência de interpretação, as presentes Condições Específicas prevalecem nos termos do artigo 3.3 das TCG.</w:t>
+        <w:t>": os Termos e Condições Gerais do Marketplace Fleequid®, aos quais as presentes Condições Específicas complementam e, na medida em que não estejam expressamente regulados, fazem referência. No caso de conflito ou divergência de interpretação, as presentes Condições Específicas prevalecem nos termos do artigo 3.3 dos TCG.</w:t>
       </w:r>
     </w:p>
     <w:p>
@@ -1817,7 +1817,7 @@
         <w:t>:</w:t>
       </w:r>
       <w:r>
-        <w:t xml:space="preserve"> a garantia opcional, não segurada, comercial e convencional pela qual a Fleequid® (Adorea S.r.l.) assume diretamente, mediante o pagamento de uma taxa, a obrigação de cobrir - sujeito aos limites, condições e exclusões estabelecidos nestes Termos e Condições Específicos e não obstante os atuais Termos e Condições Gerais do Marketplace Fleequid - Falhas e Avarias não declaradas no TrustReport relativas aos Componentes Cobertos estabelecidos na cláusula 3.3 destes Termos e Condições Específicos.</w:t>
+        <w:t xml:space="preserve"> a garantia opcional, não segurada, comercial e convencional pela qual a Fleequid® (Adorea S.r.l.) assume diretamente, mediante o pagamento de uma taxa, a obrigação de cobrir - sujeito aos limites, condições e exclusões estabelecidos nestas Condições Específicas e não obstante os atuais Termos e Condições Gerais do Marketplace Fleequid - Falhas e Avarias não declaradas no TrustReport relativas aos Componentes Cobertos estabelecidos na cláusula 3.3 destas Condições Específicas.</w:t>
       </w:r>
     </w:p>
     <w:p>
@@ -1866,7 +1866,7 @@
           <w:rFonts w:ascii="Verdana" w:hAnsi="Verdana"/>
           <w:sz w:val="20"/>
         </w:rPr>
-        <w:t>: o(s) acontecimento(s) súbito(s), imprevisível(eis) e não declarado(s) no TrustReport, que resulta(m) na perda total ou parcial da funcionalidade dos Componentes Cobertos, na aceção do artigo 3.3 das presentes Condições Específicas, tornando necessária a sua reparação ou substituição. Os defeitos, falhas ou anomalias já comunicados ou declarados no TrustReport, bem como os resultantes de desgaste normal, manutenção insuficiente ou irregular, utilização incorreta, negligência ou incumprimento das instruções do fabricante, resultantes de adulteração, intervenção não autorizada ou alterações não conformes, ou resultantes de acontecimentos acidentais ou externos, tais como acidentes, choques, incêndios, inundações, catástrofes naturais ou outros casos de força maior, não são abrangidos por esta definição e, por conseguinte, estão excluídos da cobertura ao abrigo do presente artigo. A qualificação da avaria ou mau funcionamento e a sua elegibilidade para cobertura são deixadas à apreciação técnica da Fleequid® ou do Centro Autorizado, de acordo com o procedimento previsto nos artigos 7º e 8º das presentes Condições Particulares.</w:t>
+        <w:t>: o(s) acontecimento(s) súbito(s), imprevisível(eis) e não declarado(s) no TrustReport, que resulta(m) na perda total ou parcial da funcionalidade dos Componentes Cobertos, na aceção do artigo 3.3 das presentes Condições Específicas, tornando necessária a sua reparação ou substituição. Os defeitos, falhas ou anomalias já comunicados ou declarados no TrustReport, bem como os resultantes de desgaste normal, manutenção insuficiente ou irregular, utilização incorreta, negligência ou incumprimento das instruções do fabricante, resultantes de adulteração, intervenção não autorizada ou alterações não conformes, ou resultantes de acontecimentos acidentais ou externos, tais como acidentes, choques, incêndios, inundações, catástrofes naturais ou outros casos de força maior, não são abrangidos por esta definição e, por conseguinte, estão excluídos da cobertura ao abrigo do presente artigo. A qualificação da avaria ou mau funcionamento e a sua elegibilidade para cobertura são deixadas à apreciação técnica da Fleequid® ou do Centro Autorizado, de acordo com o procedimento previsto nos artigos 7º e 8º das presentes Condições Específicas.</w:t>
       </w:r>
     </w:p>
     <w:p>
@@ -2022,7 +2022,7 @@
           <w:rFonts w:ascii="Verdana" w:hAnsi="Verdana"/>
           <w:sz w:val="20"/>
         </w:rPr>
-        <w:t xml:space="preserve">: o Veículo, conforme definido nas Condições Gerais do Marketplace Fleequid®, para o qual o Comprador solicitou e obteve a ativação do Serviço Fleequid Care® e </w:t>
+        <w:t xml:space="preserve">: o Veículo, conforme definido nos Termos e Condições Gerais do Marketplace Fleequid®, para o qual o Comprador solicitou e obteve a ativação do Serviço Fleequid Care® e </w:t>
       </w:r>
       <w:bookmarkStart w:id="2" w:name="_Hlk162160073"/>
       <w:r>
@@ -2077,7 +2077,7 @@
           <w:rFonts w:ascii="Verdana" w:hAnsi="Verdana"/>
           <w:sz w:val="20"/>
         </w:rPr>
-        <w:t>: o crédito eletrónico emitido pela Fleequid®, não convertível em dinheiro, utilizável pelo Comprador exclusivamente para compensar as Comissões devidas à Fleequid® em futuras compras ou vendas de Veículos no Marketplace Fleequid®, dentro do limite e nas condições previstas nas presentes Condições Particulares e, em particular, conforme previsto no artigo 5º.</w:t>
+        <w:t>: o crédito eletrónico emitido pela Fleequid®, não convertível em dinheiro, utilizável pelo Comprador exclusivamente para compensar as Comissões devidas à Fleequid® em futuras compras ou vendas de Veículos no Marketplace Fleequid®, dentro do limite e nas condições previstas nas presentes Condições Específicas e, em particular, conforme previsto no artigo 5º.</w:t>
       </w:r>
     </w:p>
     <w:p>
@@ -2138,7 +2138,7 @@
           <w:rFonts w:ascii="Verdana" w:hAnsi="Verdana"/>
           <w:sz w:val="20"/>
         </w:rPr>
-        <w:t xml:space="preserve">Os presentes </w:t>
+        <w:t xml:space="preserve">As presentes </w:t>
       </w:r>
       <w:r>
         <w:rPr>
@@ -2146,7 +2146,7 @@
           <w:i/>
           <w:sz w:val="20"/>
         </w:rPr>
-        <w:t>Termos e Condições Específicos do Serviço Fleequid Care®</w:t>
+        <w:t>Condições Específicas do Serviço Fleequid Care®</w:t>
       </w:r>
       <w:r>
         <w:rPr>
@@ -2201,7 +2201,7 @@
           <w:rFonts w:ascii="Verdana" w:hAnsi="Verdana"/>
           <w:sz w:val="20"/>
         </w:rPr>
-        <w:t>A garantia atua exclusivamente a favor do Comprador. O Serviço é autónomo e separado, quanto ao título e ao conteúdo, dos contratos de compra e venda do Veículo, independentemente da forma como tenham sido celebrados e estruturados ao abrigo dos Termos e Condições Gerais, e não substitui ou altera as responsabilidades legais do Vendedor decorrentes da legislação aplicável ou dos Termos e Condições Gerais. A Fleequid® assume uma obrigação direta e independente perante o Comprador apenas pelos serviços previstos nas presentes Condições Particulares; as obrigações daí decorrentes permanecem distintas das emergentes dos referidos contratos de compra e venda e não alteram o respetivo regime. A transferibilidade do Serviço é regida pelo artigo 4.5 abaixo, aqui referido na íntegra.</w:t>
+        <w:t>A garantia atua exclusivamente a favor do Comprador. O Serviço é autónomo e separado, quanto ao título e ao conteúdo, dos contratos de compra e venda do Veículo, independentemente da forma como tenham sido celebrados e estruturados ao abrigo dos Termos e Condições Gerais, e não substitui ou altera as responsabilidades legais do Vendedor decorrentes da legislação aplicável ou dos Termos e Condições Gerais. A Fleequid® assume uma obrigação direta e independente perante o Comprador apenas pelos serviços previstos nas presentes Condições Específicas; as obrigações daí decorrentes permanecem distintas das emergentes dos referidos contratos de compra e venda e não alteram o respetivo regime. A transferibilidade do Serviço é regida pelo artigo 4.5 abaixo, aqui referido na íntegra.</w:t>
       </w:r>
     </w:p>
     <w:p>
@@ -2257,7 +2257,7 @@
           <w:rFonts w:ascii="Verdana" w:hAnsi="Verdana"/>
           <w:sz w:val="20"/>
         </w:rPr>
-        <w:t>A relação entre as presentes Condições Particulares e as Condições Gerais do Marketplace Fleequid® rege-se pelo artigo 3.3 das Condições Gerais. O Comprador declara conhecer na íntegra as Condições Gerais do Marketplace Fleequid® e que as aceitou aquando do seu registo e utilização do Marketplace. Em caso de conflito ou discrepância entre as duas, prevalecem as presentes Condições Específicas, limitadas à regulamentação do Serviço Fleequid Care®.</w:t>
+        <w:t>A relação entre as presentes Condições Específicas e os Termos e Condições Gerais do Marketplace Fleequid® rege-se pelo artigo 3.3 dos Termos e Condições Gerais. O Comprador declara conhecer na íntegra os Termos e Condições Gerais do Marketplace Fleequid® e que os aceitou aquando do seu registo e utilização do Marketplace. Em caso de conflito ou discrepância entre as duas disciplinas, prevalecem as presentes Condições Específicas, limitadas à regulamentação do Serviço Fleequid Care®.</w:t>
       </w:r>
     </w:p>
     <w:p>
@@ -2702,7 +2702,7 @@
           <w:rFonts w:ascii="Verdana" w:hAnsi="Verdana"/>
           <w:sz w:val="20"/>
         </w:rPr>
-        <w:t xml:space="preserve"> - O Comprador reconhece e aceita que a cobertura do Serviço Fleequid Care® apenas atua relativamente aos componentes expressamente enumerados no ponto 3.3 do presente artigo, dentro dos limites e com as exclusões previstas nas presentes Condições Particulares, entendendo-se como excluído da garantia convencional prestada pela Fleequid® tudo o que não estiver expressamente enumerado.</w:t>
+        <w:t xml:space="preserve"> - O Comprador reconhece e aceita que a cobertura do Serviço Fleequid Care® apenas atua relativamente aos componentes expressamente enumerados no ponto 3.3 do presente artigo, dentro dos limites e com as exclusões previstas nas presentes Condições Específicas, entendendo-se como excluído da garantia convencional prestada pela Fleequid® tudo o que não estiver expressamente enumerado.</w:t>
       </w:r>
     </w:p>
     <w:p>
@@ -2877,17 +2877,17 @@
           <w:rFonts w:ascii="Verdana" w:hAnsi="Verdana"/>
           <w:sz w:val="20"/>
         </w:rPr>
-        <w:t>Fica entendido que a presente garantia não prejudica, nem limita, nem substitui as vias de recurso contratuais ou legais do Comprador contra o Vendedor, nos termos das Condições Gerais ou da legislação aplicável, relativamente a defeitos do artigo vendido.</w:t>
-      </w:r>
-      <w:r>
-        <w:t>.</w:t>
-      </w:r>
-      <w:r>
-        <w:rPr>
-          <w:rFonts w:ascii="Verdana" w:hAnsi="Verdana"/>
-          <w:sz w:val="20"/>
-        </w:rPr>
-        <w:t xml:space="preserve"> O cumprimento das obrigações da Fleequid® para com o Comprador não prejudica nem limita os direitos e vias de recurso da Fleequid® contra o Vendedor, incluindo os decorrentes de declarações incorretas, omissões ou violações das Condições Gerais. O Serviço Fleequid </w:t>
+        <w:t>Fica entendido que a presente garantia não prejudica, nem limita, nem substitui as vias de recurso contratuais ou legais do Comprador contra o Vendedor, nos termos dos Termos e Condições Gerais ou da legislação aplicável, relativamente a defeitos do artigo vendido.</w:t>
+      </w:r>
+      <w:r>
+        <w:t/>
+      </w:r>
+      <w:r>
+        <w:rPr>
+          <w:rFonts w:ascii="Verdana" w:hAnsi="Verdana"/>
+          <w:sz w:val="20"/>
+        </w:rPr>
+        <w:t xml:space="preserve"> O cumprimento das obrigações da Fleequid® para com o Comprador não prejudica nem limita os direitos e vias de recurso da Fleequid® contra o Vendedor, incluindo os decorrentes de declarações incorretas, omissões ou violações dos Termos e Condições Gerais. O Serviço Fleequid </w:t>
       </w:r>
       <w:r>
         <w:rPr>
@@ -3291,7 +3291,7 @@
           <w:sz w:val="20"/>
         </w:rPr>
         <w:lastRenderedPageBreak/>
-        <w:t>A duração e a remuneração do Serviço Fleequid Care® não são suscetíveis de alteração ou ajuste posterior, exceto no caso de revisão das presentes Condições Particulares pela Fleequid® nos termos do artigo 14º.</w:t>
+        <w:t>A duração e a remuneração do Serviço Fleequid Care® não são suscetíveis de alteração ou ajuste posterior, exceto no caso de revisão das presentes Condições Específicas pela Fleequid® nos termos do artigo 14º.</w:t>
       </w:r>
     </w:p>
     <w:p>
@@ -3359,7 +3359,7 @@
           <w:rFonts w:ascii="Verdana" w:hAnsi="Verdana"/>
           <w:sz w:val="20"/>
         </w:rPr>
-        <w:t>O Serviço Fleequid Care® prevê, para cada Veículo coberto, um limite global de 10.000,00€ (dez mil/00) acrescido de IVA, referente a toda a duração do Serviço e não acumulável com outros serviços ou garantias que possam ser ativados no mesmo Veículo. O limite superior representa o limite máximo da exposição económica da Fleequid® para todos os serviços, intervenções, reparações e indemnizações imputáveis às avarias abrangidas pelas presentes Condições Particulares.</w:t>
+        <w:t>O Serviço Fleequid Care® prevê, para cada Veículo coberto, um limite global de 10.000,00€ (dez mil/00) acrescido de IVA, referente a toda a duração do Serviço e não acumulável com outros serviços ou garantias que possam ser ativados no mesmo Veículo. O limite superior representa o limite máximo da exposição económica da Fleequid® para todos os serviços, intervenções, reparações e indemnizações imputáveis às avarias abrangidas pelas presentes Condições Específicas.</w:t>
       </w:r>
     </w:p>
     <w:p>
@@ -3701,7 +3701,7 @@
           <w:rFonts w:ascii="Verdana" w:hAnsi="Verdana"/>
           <w:sz w:val="20"/>
         </w:rPr>
-        <w:t xml:space="preserve"> e dos presentes </w:t>
+        <w:t xml:space="preserve"> e das presentes </w:t>
       </w:r>
       <w:r>
         <w:rPr>
@@ -3709,7 +3709,7 @@
           <w:i/>
           <w:sz w:val="20"/>
         </w:rPr>
-        <w:t>Termos e Condições Específicos</w:t>
+        <w:t>Condições Específicas</w:t>
       </w:r>
       <w:r>
         <w:rPr>
@@ -5990,7 +5990,7 @@
           <w:rFonts w:ascii="Verdana" w:hAnsi="Verdana"/>
           <w:sz w:val="20"/>
         </w:rPr>
-        <w:t xml:space="preserve"> não limita, nem prejudica, nem substitui quaisquer direitos do Comprador contra o Vendedor decorrentes das </w:t>
+        <w:t xml:space="preserve"> não limita, nem prejudica, nem substitui quaisquer direitos do Comprador contra o Vendedor decorrentes dos </w:t>
       </w:r>
       <w:r>
         <w:rPr>
@@ -5998,7 +5998,7 @@
           <w:i/>
           <w:sz w:val="20"/>
         </w:rPr>
-        <w:t>Condições Gerais</w:t>
+        <w:t>Termos e Condições Gerais</w:t>
       </w:r>
       <w:r>
         <w:rPr>
@@ -6747,7 +6747,7 @@
           <w:rFonts w:ascii="Verdana" w:hAnsi="Verdana"/>
           <w:sz w:val="20"/>
         </w:rPr>
-        <w:t>Para tudo o que não estiver expressamente previsto no presente artigo, aplica-se o Artigo 3.º das Condições Gerais do Marketplace Fleequid® relativo às alterações unilaterais das Condições contratuais, o qual se considera estar integralmente transcrito no presente documento.</w:t>
+        <w:t>Para tudo o que não estiver expressamente previsto no presente artigo, aplica-se o Artigo 3.º dos Termos e Condições Gerais do Marketplace Fleequid® relativo às alterações unilaterais das Condições contratuais, o qual se considera estar integralmente transcrito no presente documento.</w:t>
       </w:r>
     </w:p>
     <w:p>

</xml_diff>